<commit_message>
Corrige Arquitectura_EPS.docx: version incompleta reemplazada por la version completa con diagrama
</commit_message>
<xml_diff>
--- a/Docs/Arquitectura_EPS.docx
+++ b/Docs/Arquitectura_EPS.docx
@@ -2,11 +2,1907 @@
 <file path=word/document.xml><?xml version="1.0" encoding="utf-8"?>
 <w:document xmlns:wpc="http://schemas.microsoft.com/office/word/2010/wordprocessingCanvas" xmlns:cx="http://schemas.microsoft.com/office/drawing/2014/chartex" xmlns:cx1="http://schemas.microsoft.com/office/drawing/2015/9/8/chartex" xmlns:cx2="http://schemas.microsoft.com/office/drawing/2015/10/21/chartex" xmlns:cx3="http://schemas.microsoft.com/office/drawing/2016/5/9/chartex" xmlns:cx4="http://schemas.microsoft.com/office/drawing/2016/5/10/chartex" xmlns:cx5="http://schemas.microsoft.com/office/drawing/2016/5/11/chartex" xmlns:cx6="http://schemas.microsoft.com/office/drawing/2016/5/12/chartex" xmlns:cx7="http://schemas.microsoft.com/office/drawing/2016/5/13/chartex" xmlns:cx8="http://schemas.microsoft.com/office/drawing/2016/5/14/chartex" xmlns:mc="http://schemas.openxmlformats.org/markup-compatibility/2006" xmlns:aink="http://schemas.microsoft.com/office/drawing/2016/ink" xmlns:am3d="http://schemas.microsoft.com/office/drawing/2017/model3d" xmlns:o="urn:schemas-microsoft-com:office:office" xmlns:oel="http://schemas.microsoft.com/office/2019/extlst" xmlns:r="http://schemas.openxmlformats.org/officeDocument/2006/relationships" xmlns:m="http://schemas.openxmlformats.org/officeDocument/2006/math" xmlns:v="urn:schemas-microsoft-com:vml" xmlns:wp14="http://schemas.microsoft.com/office/word/2010/wordprocessingDrawing" xmlns:wp="http://schemas.openxmlformats.org/drawingml/2006/wordprocessingDrawing" xmlns:w10="urn:schemas-microsoft-com:office:word" xmlns:w="http://schemas.openxmlformats.org/wordprocessingml/2006/main" xmlns:w14="http://schemas.microsoft.com/office/word/2010/wordml" xmlns:w15="http://schemas.microsoft.com/office/word/2012/wordml" xmlns:w16cex="http://schemas.microsoft.com/office/word/2018/wordml/cex" xmlns:w16cid="http://schemas.microsoft.com/office/word/2016/wordml/cid" xmlns:w16="http://schemas.microsoft.com/office/word/2018/wordml" xmlns:w16du="http://schemas.microsoft.com/office/word/2023/wordml/word16du" xmlns:w16sdtdh="http://schemas.microsoft.com/office/word/2020/wordml/sdtdatahash" xmlns:w16sdtfl="http://schemas.microsoft.com/office/word/2024/wordml/sdtformatlock" xmlns:w16se="http://schemas.microsoft.com/office/word/2015/wordml/symex" xmlns:wpg="http://schemas.microsoft.com/office/word/2010/wordprocessingGroup" xmlns:wpi="http://schemas.microsoft.com/office/word/2010/wordprocessingInk" xmlns:wne="http://schemas.microsoft.com/office/word/2006/wordml" xmlns:wps="http://schemas.microsoft.com/office/word/2010/wordprocessingShape" mc:Ignorable="w14 w15 w16se w16cid w16 w16cex w16sdtdh w16sdtfl w16du wp14">
   <w:body>
+    <w:p>
+      <w:pPr>
+        <w:spacing w:after="60"/>
+        <w:jc w:val="center"/>
+      </w:pPr>
+      <w:r>
+        <w:rPr>
+          <w:b/>
+          <w:bCs/>
+          <w:sz w:val="32"/>
+          <w:szCs w:val="32"/>
+        </w:rPr>
+        <w:t>ARQUITECTURA DE MICROSERVICIOS</w:t>
+      </w:r>
+    </w:p>
+    <w:p>
+      <w:pPr>
+        <w:spacing w:after="300"/>
+        <w:jc w:val="center"/>
+      </w:pPr>
+      <w:r>
+        <w:rPr>
+          <w:i/>
+          <w:iCs/>
+          <w:sz w:val="22"/>
+          <w:szCs w:val="22"/>
+        </w:rPr>
+        <w:t>Sistema de información de una EPS (Entidad Promotora de Salud)</w:t>
+      </w:r>
+    </w:p>
+    <w:p>
+      <w:pPr>
+        <w:pStyle w:val="Ttulo1"/>
+        <w:spacing w:before="300" w:after="150"/>
+      </w:pPr>
+      <w:r>
+        <w:t>1. Introducción</w:t>
+      </w:r>
+    </w:p>
+    <w:p>
+      <w:pPr>
+        <w:spacing w:after="120"/>
+      </w:pPr>
+      <w:r>
+        <w:t>Este documento describe la arquitectura de microservicios propuesta para el sistema de información de una EPS, en el marco del taller de control de versiones de Ingeniería de Software III. En lugar de una aplicación monolítica, el sistema se divide en servicios pequeños e independientes, cada uno responsable de un dominio de negocio concreto (afiliados, citas, autorizaciones, facturación, notificaciones), lo que facilita el despliegue independiente, la escalabilidad selectiva y el aislamiento de fallos.</w:t>
+      </w:r>
+    </w:p>
+    <w:p>
+      <w:pPr>
+        <w:pStyle w:val="Ttulo1"/>
+        <w:spacing w:before="300" w:after="150"/>
+      </w:pPr>
+      <w:r>
+        <w:t>2. Descripción general de la arquitectura</w:t>
+      </w:r>
+    </w:p>
+    <w:p>
+      <w:pPr>
+        <w:spacing w:after="120"/>
+      </w:pPr>
+      <w:r>
+        <w:t>La arquitectura se organiza en las siguientes capas:</w:t>
+      </w:r>
+    </w:p>
+    <w:p>
+      <w:pPr>
+        <w:pStyle w:val="Prrafodelista"/>
+        <w:numPr>
+          <w:ilvl w:val="0"/>
+          <w:numId w:val="3"/>
+        </w:numPr>
+        <w:spacing w:after="60"/>
+        <w:contextualSpacing w:val="0"/>
+      </w:pPr>
+      <w:r>
+        <w:t>Cliente: aplicaciones web y móviles usadas por afiliados, personal médico y administrativo.</w:t>
+      </w:r>
+    </w:p>
+    <w:p>
+      <w:pPr>
+        <w:pStyle w:val="Prrafodelista"/>
+        <w:numPr>
+          <w:ilvl w:val="0"/>
+          <w:numId w:val="3"/>
+        </w:numPr>
+        <w:spacing w:after="60"/>
+        <w:contextualSpacing w:val="0"/>
+      </w:pPr>
+      <w:r>
+        <w:t>API Gateway: punto único de entrada que enruta las peticiones al microservicio correspondiente, centraliza la autenticación y aplica límites de uso (</w:t>
+      </w:r>
+      <w:proofErr w:type="spellStart"/>
+      <w:r>
+        <w:t>rate</w:t>
+      </w:r>
+      <w:proofErr w:type="spellEnd"/>
+      <w:r>
+        <w:t xml:space="preserve"> </w:t>
+      </w:r>
+      <w:proofErr w:type="spellStart"/>
+      <w:r>
+        <w:t>limiting</w:t>
+      </w:r>
+      <w:proofErr w:type="spellEnd"/>
+      <w:r>
+        <w:t>).</w:t>
+      </w:r>
+    </w:p>
+    <w:p>
+      <w:pPr>
+        <w:pStyle w:val="Prrafodelista"/>
+        <w:numPr>
+          <w:ilvl w:val="0"/>
+          <w:numId w:val="3"/>
+        </w:numPr>
+        <w:spacing w:after="60"/>
+        <w:contextualSpacing w:val="0"/>
+      </w:pPr>
+      <w:r>
+        <w:t xml:space="preserve">Microservicios de dominio: cada uno expone su propia API REST y administra exclusivamente su propia base de datos (patrón </w:t>
+      </w:r>
+      <w:proofErr w:type="spellStart"/>
+      <w:r>
+        <w:t>Database</w:t>
+      </w:r>
+      <w:proofErr w:type="spellEnd"/>
+      <w:r>
+        <w:t xml:space="preserve"> per Service), sin acceso directo a los datos de otro servicio.</w:t>
+      </w:r>
+    </w:p>
+    <w:p>
+      <w:pPr>
+        <w:pStyle w:val="Prrafodelista"/>
+        <w:numPr>
+          <w:ilvl w:val="0"/>
+          <w:numId w:val="3"/>
+        </w:numPr>
+        <w:spacing w:after="60"/>
+        <w:contextualSpacing w:val="0"/>
+      </w:pPr>
+      <w:proofErr w:type="spellStart"/>
+      <w:r>
+        <w:t>Message</w:t>
+      </w:r>
+      <w:proofErr w:type="spellEnd"/>
+      <w:r>
+        <w:t xml:space="preserve"> Broker: canal de eventos asíncronos que permite que los servicios se comuniquen sin acoplarse directamente entre sí.</w:t>
+      </w:r>
+    </w:p>
+    <w:p>
+      <w:pPr>
+        <w:pStyle w:val="Ttulo1"/>
+        <w:spacing w:before="300" w:after="150"/>
+      </w:pPr>
+      <w:r>
+        <w:t>3. Microservicios propuestos</w:t>
+      </w:r>
+    </w:p>
+    <w:tbl>
+      <w:tblPr>
+        <w:tblW w:w="5000" w:type="pct"/>
+        <w:tblBorders>
+          <w:top w:val="single" w:sz="4" w:space="0" w:color="auto"/>
+          <w:left w:val="single" w:sz="4" w:space="0" w:color="auto"/>
+          <w:bottom w:val="single" w:sz="4" w:space="0" w:color="auto"/>
+          <w:right w:val="single" w:sz="4" w:space="0" w:color="auto"/>
+          <w:insideH w:val="single" w:sz="4" w:space="0" w:color="auto"/>
+          <w:insideV w:val="single" w:sz="4" w:space="0" w:color="auto"/>
+        </w:tblBorders>
+        <w:tblCellMar>
+          <w:left w:w="10" w:type="dxa"/>
+          <w:right w:w="10" w:type="dxa"/>
+        </w:tblCellMar>
+        <w:tblLook w:val="0000" w:firstRow="0" w:lastRow="0" w:firstColumn="0" w:lastColumn="0" w:noHBand="0" w:noVBand="0"/>
+      </w:tblPr>
+      <w:tblGrid>
+        <w:gridCol w:w="1401"/>
+        <w:gridCol w:w="4980"/>
+        <w:gridCol w:w="2969"/>
+      </w:tblGrid>
+      <w:tr>
+        <w:tblPrEx>
+          <w:tblCellMar>
+            <w:top w:w="0" w:type="dxa"/>
+            <w:bottom w:w="0" w:type="dxa"/>
+          </w:tblCellMar>
+        </w:tblPrEx>
+        <w:tc>
+          <w:tcPr>
+            <w:tcW w:w="0" w:type="auto"/>
+            <w:shd w:val="clear" w:color="auto" w:fill="1F4E79"/>
+          </w:tcPr>
+          <w:p>
+            <w:r>
+              <w:rPr>
+                <w:b/>
+                <w:bCs/>
+                <w:color w:val="FFFFFF"/>
+              </w:rPr>
+              <w:t>Microservicio</w:t>
+            </w:r>
+          </w:p>
+        </w:tc>
+        <w:tc>
+          <w:tcPr>
+            <w:tcW w:w="0" w:type="auto"/>
+            <w:shd w:val="clear" w:color="auto" w:fill="1F4E79"/>
+          </w:tcPr>
+          <w:p>
+            <w:r>
+              <w:rPr>
+                <w:b/>
+                <w:bCs/>
+                <w:color w:val="FFFFFF"/>
+              </w:rPr>
+              <w:t>Responsabilidad</w:t>
+            </w:r>
+          </w:p>
+        </w:tc>
+        <w:tc>
+          <w:tcPr>
+            <w:tcW w:w="0" w:type="auto"/>
+            <w:shd w:val="clear" w:color="auto" w:fill="1F4E79"/>
+          </w:tcPr>
+          <w:p>
+            <w:r>
+              <w:rPr>
+                <w:b/>
+                <w:bCs/>
+                <w:color w:val="FFFFFF"/>
+              </w:rPr>
+              <w:t>Base de datos propia</w:t>
+            </w:r>
+          </w:p>
+        </w:tc>
+      </w:tr>
+      <w:tr>
+        <w:tblPrEx>
+          <w:tblCellMar>
+            <w:top w:w="0" w:type="dxa"/>
+            <w:bottom w:w="0" w:type="dxa"/>
+          </w:tblCellMar>
+        </w:tblPrEx>
+        <w:tc>
+          <w:tcPr>
+            <w:tcW w:w="0" w:type="auto"/>
+          </w:tcPr>
+          <w:p>
+            <w:r>
+              <w:t>ms-pacientes</w:t>
+            </w:r>
+          </w:p>
+        </w:tc>
+        <w:tc>
+          <w:tcPr>
+            <w:tcW w:w="0" w:type="auto"/>
+          </w:tcPr>
+          <w:p>
+            <w:r>
+              <w:t>Gestiona los datos de afiliación y demográficos de cada paciente de la EPS.</w:t>
+            </w:r>
+          </w:p>
+        </w:tc>
+        <w:tc>
+          <w:tcPr>
+            <w:tcW w:w="0" w:type="auto"/>
+          </w:tcPr>
+          <w:p>
+            <w:r>
+              <w:t>BD Pacientes</w:t>
+            </w:r>
+          </w:p>
+        </w:tc>
+      </w:tr>
+      <w:tr>
+        <w:tblPrEx>
+          <w:tblCellMar>
+            <w:top w:w="0" w:type="dxa"/>
+            <w:bottom w:w="0" w:type="dxa"/>
+          </w:tblCellMar>
+        </w:tblPrEx>
+        <w:tc>
+          <w:tcPr>
+            <w:tcW w:w="0" w:type="auto"/>
+          </w:tcPr>
+          <w:p>
+            <w:r>
+              <w:t>ms-citas</w:t>
+            </w:r>
+          </w:p>
+        </w:tc>
+        <w:tc>
+          <w:tcPr>
+            <w:tcW w:w="0" w:type="auto"/>
+          </w:tcPr>
+          <w:p>
+            <w:r>
+              <w:t>Agendamiento, reprogramación y cancelación de citas médicas.</w:t>
+            </w:r>
+          </w:p>
+        </w:tc>
+        <w:tc>
+          <w:tcPr>
+            <w:tcW w:w="0" w:type="auto"/>
+          </w:tcPr>
+          <w:p>
+            <w:r>
+              <w:t>BD Citas</w:t>
+            </w:r>
+          </w:p>
+        </w:tc>
+      </w:tr>
+      <w:tr>
+        <w:tblPrEx>
+          <w:tblCellMar>
+            <w:top w:w="0" w:type="dxa"/>
+            <w:bottom w:w="0" w:type="dxa"/>
+          </w:tblCellMar>
+        </w:tblPrEx>
+        <w:tc>
+          <w:tcPr>
+            <w:tcW w:w="0" w:type="auto"/>
+          </w:tcPr>
+          <w:p>
+            <w:r>
+              <w:t>ms-autorizaciones</w:t>
+            </w:r>
+          </w:p>
+        </w:tc>
+        <w:tc>
+          <w:tcPr>
+            <w:tcW w:w="0" w:type="auto"/>
+          </w:tcPr>
+          <w:p>
+            <w:r>
+              <w:t>Autorización de procedimientos y servicios médicos según cobertura del plan.</w:t>
+            </w:r>
+          </w:p>
+        </w:tc>
+        <w:tc>
+          <w:tcPr>
+            <w:tcW w:w="0" w:type="auto"/>
+          </w:tcPr>
+          <w:p>
+            <w:r>
+              <w:t>BD Autorizaciones</w:t>
+            </w:r>
+          </w:p>
+        </w:tc>
+      </w:tr>
+      <w:tr>
+        <w:tblPrEx>
+          <w:tblCellMar>
+            <w:top w:w="0" w:type="dxa"/>
+            <w:bottom w:w="0" w:type="dxa"/>
+          </w:tblCellMar>
+        </w:tblPrEx>
+        <w:tc>
+          <w:tcPr>
+            <w:tcW w:w="0" w:type="auto"/>
+          </w:tcPr>
+          <w:p>
+            <w:r>
+              <w:t>ms-</w:t>
+            </w:r>
+            <w:proofErr w:type="spellStart"/>
+            <w:r>
+              <w:t>facturacion</w:t>
+            </w:r>
+            <w:proofErr w:type="spellEnd"/>
+          </w:p>
+        </w:tc>
+        <w:tc>
+          <w:tcPr>
+            <w:tcW w:w="0" w:type="auto"/>
+          </w:tcPr>
+          <w:p>
+            <w:r>
+              <w:t>Procesa cobros, copagos y liquidaciones con el sistema de salud.</w:t>
+            </w:r>
+          </w:p>
+        </w:tc>
+        <w:tc>
+          <w:tcPr>
+            <w:tcW w:w="0" w:type="auto"/>
+          </w:tcPr>
+          <w:p>
+            <w:r>
+              <w:t>BD Facturación</w:t>
+            </w:r>
+          </w:p>
+        </w:tc>
+      </w:tr>
+      <w:tr>
+        <w:tblPrEx>
+          <w:tblCellMar>
+            <w:top w:w="0" w:type="dxa"/>
+            <w:bottom w:w="0" w:type="dxa"/>
+          </w:tblCellMar>
+        </w:tblPrEx>
+        <w:tc>
+          <w:tcPr>
+            <w:tcW w:w="0" w:type="auto"/>
+          </w:tcPr>
+          <w:p>
+            <w:r>
+              <w:t>ms-notificaciones</w:t>
+            </w:r>
+          </w:p>
+        </w:tc>
+        <w:tc>
+          <w:tcPr>
+            <w:tcW w:w="0" w:type="auto"/>
+          </w:tcPr>
+          <w:p>
+            <w:r>
+              <w:t>Envía recordatorios de citas y alertas al afiliado por correo o SMS.</w:t>
+            </w:r>
+          </w:p>
+        </w:tc>
+        <w:tc>
+          <w:tcPr>
+            <w:tcW w:w="0" w:type="auto"/>
+          </w:tcPr>
+          <w:p>
+            <w:r>
+              <w:t>No persiste datos propios (consume eventos)</w:t>
+            </w:r>
+          </w:p>
+        </w:tc>
+      </w:tr>
+    </w:tbl>
+    <w:p>
+      <w:pPr>
+        <w:spacing w:after="200"/>
+      </w:pPr>
+    </w:p>
+    <w:p>
+      <w:pPr>
+        <w:pStyle w:val="Ttulo1"/>
+        <w:spacing w:before="300" w:after="150"/>
+      </w:pPr>
+      <w:r>
+        <w:t>4. Comunicación entre microservicios</w:t>
+      </w:r>
+    </w:p>
+    <w:p>
+      <w:pPr>
+        <w:spacing w:after="120"/>
+      </w:pPr>
+      <w:r>
+        <w:t>Se combinan dos estilos de comunicación:</w:t>
+      </w:r>
+    </w:p>
+    <w:p>
+      <w:pPr>
+        <w:pStyle w:val="Prrafodelista"/>
+        <w:numPr>
+          <w:ilvl w:val="0"/>
+          <w:numId w:val="3"/>
+        </w:numPr>
+        <w:spacing w:after="60"/>
+        <w:contextualSpacing w:val="0"/>
+      </w:pPr>
+      <w:r>
+        <w:t xml:space="preserve">Síncrona (REST vía API Gateway): usada cuando el cliente necesita una respuesta inmediata, por </w:t>
+      </w:r>
+      <w:proofErr w:type="gramStart"/>
+      <w:r>
+        <w:t>ejemplo</w:t>
+      </w:r>
+      <w:proofErr w:type="gramEnd"/>
+      <w:r>
+        <w:t xml:space="preserve"> al consultar disponibilidad de citas o al validar una autorización antes de generar un cargo.</w:t>
+      </w:r>
+    </w:p>
+    <w:p>
+      <w:pPr>
+        <w:pStyle w:val="Prrafodelista"/>
+        <w:numPr>
+          <w:ilvl w:val="0"/>
+          <w:numId w:val="3"/>
+        </w:numPr>
+        <w:spacing w:after="60"/>
+        <w:contextualSpacing w:val="0"/>
+      </w:pPr>
+      <w:r>
+        <w:t xml:space="preserve">Asíncrona (eventos vía </w:t>
+      </w:r>
+      <w:proofErr w:type="spellStart"/>
+      <w:r>
+        <w:t>Message</w:t>
+      </w:r>
+      <w:proofErr w:type="spellEnd"/>
+      <w:r>
+        <w:t xml:space="preserve"> Broker): usada para desacoplar procesos que no requieren respuesta inmediata. Por ejemplo, ms-citas publica el evento '</w:t>
+      </w:r>
+      <w:proofErr w:type="spellStart"/>
+      <w:r>
+        <w:t>cita_creada</w:t>
+      </w:r>
+      <w:proofErr w:type="spellEnd"/>
+      <w:r>
+        <w:t>', ms-autorizaciones publica '</w:t>
+      </w:r>
+      <w:proofErr w:type="spellStart"/>
+      <w:r>
+        <w:t>autorizacion_emitida</w:t>
+      </w:r>
+      <w:proofErr w:type="spellEnd"/>
+      <w:r>
+        <w:t>' y ms-</w:t>
+      </w:r>
+      <w:proofErr w:type="spellStart"/>
+      <w:r>
+        <w:t>facturacion</w:t>
+      </w:r>
+      <w:proofErr w:type="spellEnd"/>
+      <w:r>
+        <w:t xml:space="preserve"> publica '</w:t>
+      </w:r>
+      <w:proofErr w:type="spellStart"/>
+      <w:r>
+        <w:t>pago_confirmado</w:t>
+      </w:r>
+      <w:proofErr w:type="spellEnd"/>
+      <w:r>
+        <w:t>'; ms-notificaciones consume estos eventos para enviar el aviso correspondiente sin que los demás servicios dependan de él.</w:t>
+      </w:r>
+    </w:p>
+    <w:p>
+      <w:pPr>
+        <w:pStyle w:val="Ttulo1"/>
+        <w:spacing w:before="300" w:after="150"/>
+      </w:pPr>
+      <w:r>
+        <w:t>5. Patrones aplicados</w:t>
+      </w:r>
+    </w:p>
+    <w:p>
+      <w:pPr>
+        <w:pStyle w:val="Prrafodelista"/>
+        <w:numPr>
+          <w:ilvl w:val="0"/>
+          <w:numId w:val="3"/>
+        </w:numPr>
+        <w:spacing w:after="60"/>
+        <w:contextualSpacing w:val="0"/>
+      </w:pPr>
+      <w:r>
+        <w:t>API Gateway: punto único de entrada y autenticación centralizada.</w:t>
+      </w:r>
+    </w:p>
+    <w:p>
+      <w:pPr>
+        <w:pStyle w:val="Prrafodelista"/>
+        <w:numPr>
+          <w:ilvl w:val="0"/>
+          <w:numId w:val="3"/>
+        </w:numPr>
+        <w:spacing w:after="60"/>
+        <w:contextualSpacing w:val="0"/>
+      </w:pPr>
+      <w:proofErr w:type="spellStart"/>
+      <w:r>
+        <w:lastRenderedPageBreak/>
+        <w:t>Database</w:t>
+      </w:r>
+      <w:proofErr w:type="spellEnd"/>
+      <w:r>
+        <w:t xml:space="preserve"> per Service: cada microservicio es dueño exclusivo de sus datos.</w:t>
+      </w:r>
+    </w:p>
+    <w:p>
+      <w:pPr>
+        <w:pStyle w:val="Prrafodelista"/>
+        <w:numPr>
+          <w:ilvl w:val="0"/>
+          <w:numId w:val="3"/>
+        </w:numPr>
+        <w:spacing w:after="60"/>
+        <w:contextualSpacing w:val="0"/>
+      </w:pPr>
+      <w:proofErr w:type="spellStart"/>
+      <w:r>
+        <w:t>Event-Driven</w:t>
+      </w:r>
+      <w:proofErr w:type="spellEnd"/>
+      <w:r>
+        <w:t xml:space="preserve"> </w:t>
+      </w:r>
+      <w:proofErr w:type="spellStart"/>
+      <w:r>
+        <w:t>Architecture</w:t>
+      </w:r>
+      <w:proofErr w:type="spellEnd"/>
+      <w:r>
+        <w:t xml:space="preserve">: comunicación asíncrona mediante el </w:t>
+      </w:r>
+      <w:proofErr w:type="spellStart"/>
+      <w:r>
+        <w:t>message</w:t>
+      </w:r>
+      <w:proofErr w:type="spellEnd"/>
+      <w:r>
+        <w:t xml:space="preserve"> </w:t>
+      </w:r>
+      <w:proofErr w:type="spellStart"/>
+      <w:r>
+        <w:t>broker</w:t>
+      </w:r>
+      <w:proofErr w:type="spellEnd"/>
+      <w:r>
+        <w:t xml:space="preserve"> para reducir el acoplamiento.</w:t>
+      </w:r>
+    </w:p>
+    <w:p>
+      <w:pPr>
+        <w:pStyle w:val="Prrafodelista"/>
+        <w:numPr>
+          <w:ilvl w:val="0"/>
+          <w:numId w:val="3"/>
+        </w:numPr>
+        <w:spacing w:after="60"/>
+        <w:contextualSpacing w:val="0"/>
+      </w:pPr>
+      <w:r>
+        <w:t>Separación por dominio (Domain-</w:t>
+      </w:r>
+      <w:proofErr w:type="spellStart"/>
+      <w:r>
+        <w:t>Driven</w:t>
+      </w:r>
+      <w:proofErr w:type="spellEnd"/>
+      <w:r>
+        <w:t xml:space="preserve"> </w:t>
+      </w:r>
+      <w:proofErr w:type="spellStart"/>
+      <w:r>
+        <w:t>Design</w:t>
+      </w:r>
+      <w:proofErr w:type="spellEnd"/>
+      <w:r>
+        <w:t xml:space="preserve"> a nivel de límites de servicio): cada microservicio representa un subdominio del negocio de la EPS.</w:t>
+      </w:r>
+    </w:p>
+    <w:p>
+      <w:pPr>
+        <w:pStyle w:val="Ttulo1"/>
+        <w:spacing w:before="300" w:after="150"/>
+      </w:pPr>
+      <w:r>
+        <w:t>6. Diagrama de la arquitectura</w:t>
+      </w:r>
+    </w:p>
+    <w:p>
+      <w:pPr>
+        <w:spacing w:after="120"/>
+      </w:pPr>
+      <w:r>
+        <w:t>El siguiente diagrama representa los componentes descritos y sus relaciones:</w:t>
+      </w:r>
+    </w:p>
+    <w:p>
+      <w:pPr>
+        <w:spacing w:after="120"/>
+      </w:pPr>
+    </w:p>
+    <w:p>
+      <w:pPr>
+        <w:jc w:val="center"/>
+      </w:pPr>
+      <w:r>
+        <w:rPr>
+          <w:noProof/>
+        </w:rPr>
+        <w:drawing>
+          <wp:inline distT="0" distB="0" distL="0" distR="0" wp14:anchorId="5FD1127F" wp14:editId="72BF70C5">
+            <wp:extent cx="5238750" cy="4095750"/>
+            <wp:effectExtent l="0" t="0" r="0" b="0"/>
+            <wp:docPr id="1" name="Imagen 1"/>
+            <wp:cNvGraphicFramePr>
+              <a:graphicFrameLocks xmlns:a="http://schemas.openxmlformats.org/drawingml/2006/main" noChangeAspect="1"/>
+            </wp:cNvGraphicFramePr>
+            <a:graphic xmlns:a="http://schemas.openxmlformats.org/drawingml/2006/main">
+              <a:graphicData uri="http://schemas.openxmlformats.org/drawingml/2006/picture">
+                <pic:pic xmlns:pic="http://schemas.openxmlformats.org/drawingml/2006/picture">
+                  <pic:nvPicPr>
+                    <pic:cNvPr id="0" name=""/>
+                    <pic:cNvPicPr>
+                      <a:picLocks noChangeAspect="1" noChangeArrowheads="1"/>
+                    </pic:cNvPicPr>
+                  </pic:nvPicPr>
+                  <pic:blipFill>
+                    <a:blip r:embed="rId5"/>
+                    <a:srcRect/>
+                    <a:stretch>
+                      <a:fillRect/>
+                    </a:stretch>
+                  </pic:blipFill>
+                  <pic:spPr bwMode="auto">
+                    <a:xfrm>
+                      <a:off x="0" y="0"/>
+                      <a:ext cx="5238750" cy="4095750"/>
+                    </a:xfrm>
+                    <a:prstGeom prst="rect">
+                      <a:avLst/>
+                    </a:prstGeom>
+                  </pic:spPr>
+                </pic:pic>
+              </a:graphicData>
+            </a:graphic>
+          </wp:inline>
+        </w:drawing>
+      </w:r>
+    </w:p>
+    <w:p>
+      <w:pPr>
+        <w:spacing w:after="100"/>
+      </w:pPr>
+    </w:p>
+    <w:p>
+      <w:r>
+        <w:br w:type="page"/>
+      </w:r>
+    </w:p>
+    <w:p>
+      <w:pPr>
+        <w:pStyle w:val="Ttulo1"/>
+        <w:spacing w:before="300" w:after="150"/>
+      </w:pPr>
+      <w:r>
+        <w:lastRenderedPageBreak/>
+        <w:t>Anexo. Código fuente del diagrama (</w:t>
+      </w:r>
+      <w:proofErr w:type="spellStart"/>
+      <w:r>
+        <w:t>PlantUML</w:t>
+      </w:r>
+      <w:proofErr w:type="spellEnd"/>
+      <w:r>
+        <w:t>)</w:t>
+      </w:r>
+    </w:p>
+    <w:p>
+      <w:pPr>
+        <w:spacing w:after="120"/>
+      </w:pPr>
+      <w:r>
+        <w:t xml:space="preserve">El diagrama anterior fue generado a partir de la siguiente descripción, equivalente en notación </w:t>
+      </w:r>
+      <w:proofErr w:type="spellStart"/>
+      <w:r>
+        <w:t>PlantUML</w:t>
+      </w:r>
+      <w:proofErr w:type="spellEnd"/>
+      <w:r>
+        <w:t xml:space="preserve"> (</w:t>
+      </w:r>
+      <w:proofErr w:type="spellStart"/>
+      <w:r>
+        <w:t>component</w:t>
+      </w:r>
+      <w:proofErr w:type="spellEnd"/>
+      <w:r>
+        <w:t xml:space="preserve"> </w:t>
+      </w:r>
+      <w:proofErr w:type="spellStart"/>
+      <w:r>
+        <w:t>diagram</w:t>
+      </w:r>
+      <w:proofErr w:type="spellEnd"/>
+      <w:r>
+        <w:t xml:space="preserve">). Puede renderizarse en cualquier editor </w:t>
+      </w:r>
+      <w:proofErr w:type="spellStart"/>
+      <w:r>
+        <w:t>PlantUML</w:t>
+      </w:r>
+      <w:proofErr w:type="spellEnd"/>
+      <w:r>
+        <w:t xml:space="preserve"> (por ejemplo plantuml.com o la extensión de VS Code) para regenerarlo o modificarlo:</w:t>
+      </w:r>
+    </w:p>
+    <w:p>
+      <w:pPr>
+        <w:rPr>
+          <w:lang w:val="en-US"/>
+        </w:rPr>
+      </w:pPr>
+      <w:r>
+        <w:rPr>
+          <w:rFonts w:ascii="Consolas" w:eastAsia="Consolas" w:hAnsi="Consolas" w:cs="Consolas"/>
+          <w:sz w:val="18"/>
+          <w:szCs w:val="18"/>
+          <w:lang w:val="en-US"/>
+        </w:rPr>
+        <w:t>@startuml</w:t>
+      </w:r>
+    </w:p>
+    <w:p>
+      <w:pPr>
+        <w:rPr>
+          <w:lang w:val="en-US"/>
+        </w:rPr>
+      </w:pPr>
+      <w:proofErr w:type="spellStart"/>
+      <w:r>
+        <w:rPr>
+          <w:rFonts w:ascii="Consolas" w:eastAsia="Consolas" w:hAnsi="Consolas" w:cs="Consolas"/>
+          <w:sz w:val="18"/>
+          <w:szCs w:val="18"/>
+          <w:lang w:val="en-US"/>
+        </w:rPr>
+        <w:t>skinparam</w:t>
+      </w:r>
+      <w:proofErr w:type="spellEnd"/>
+      <w:r>
+        <w:rPr>
+          <w:rFonts w:ascii="Consolas" w:eastAsia="Consolas" w:hAnsi="Consolas" w:cs="Consolas"/>
+          <w:sz w:val="18"/>
+          <w:szCs w:val="18"/>
+          <w:lang w:val="en-US"/>
+        </w:rPr>
+        <w:t xml:space="preserve"> </w:t>
+      </w:r>
+      <w:proofErr w:type="spellStart"/>
+      <w:r>
+        <w:rPr>
+          <w:rFonts w:ascii="Consolas" w:eastAsia="Consolas" w:hAnsi="Consolas" w:cs="Consolas"/>
+          <w:sz w:val="18"/>
+          <w:szCs w:val="18"/>
+          <w:lang w:val="en-US"/>
+        </w:rPr>
+        <w:t>componentStyle</w:t>
+      </w:r>
+      <w:proofErr w:type="spellEnd"/>
+      <w:r>
+        <w:rPr>
+          <w:rFonts w:ascii="Consolas" w:eastAsia="Consolas" w:hAnsi="Consolas" w:cs="Consolas"/>
+          <w:sz w:val="18"/>
+          <w:szCs w:val="18"/>
+          <w:lang w:val="en-US"/>
+        </w:rPr>
+        <w:t xml:space="preserve"> rectangle</w:t>
+      </w:r>
+    </w:p>
+    <w:p>
+      <w:pPr>
+        <w:rPr>
+          <w:lang w:val="en-US"/>
+        </w:rPr>
+      </w:pPr>
+      <w:proofErr w:type="spellStart"/>
+      <w:r>
+        <w:rPr>
+          <w:rFonts w:ascii="Consolas" w:eastAsia="Consolas" w:hAnsi="Consolas" w:cs="Consolas"/>
+          <w:sz w:val="18"/>
+          <w:szCs w:val="18"/>
+          <w:lang w:val="en-US"/>
+        </w:rPr>
+        <w:t>skinparam</w:t>
+      </w:r>
+      <w:proofErr w:type="spellEnd"/>
+      <w:r>
+        <w:rPr>
+          <w:rFonts w:ascii="Consolas" w:eastAsia="Consolas" w:hAnsi="Consolas" w:cs="Consolas"/>
+          <w:sz w:val="18"/>
+          <w:szCs w:val="18"/>
+          <w:lang w:val="en-US"/>
+        </w:rPr>
+        <w:t xml:space="preserve"> </w:t>
+      </w:r>
+      <w:proofErr w:type="spellStart"/>
+      <w:r>
+        <w:rPr>
+          <w:rFonts w:ascii="Consolas" w:eastAsia="Consolas" w:hAnsi="Consolas" w:cs="Consolas"/>
+          <w:sz w:val="18"/>
+          <w:szCs w:val="18"/>
+          <w:lang w:val="en-US"/>
+        </w:rPr>
+        <w:t>backgroundColor</w:t>
+      </w:r>
+      <w:proofErr w:type="spellEnd"/>
+      <w:r>
+        <w:rPr>
+          <w:rFonts w:ascii="Consolas" w:eastAsia="Consolas" w:hAnsi="Consolas" w:cs="Consolas"/>
+          <w:sz w:val="18"/>
+          <w:szCs w:val="18"/>
+          <w:lang w:val="en-US"/>
+        </w:rPr>
+        <w:t xml:space="preserve"> white</w:t>
+      </w:r>
+    </w:p>
+    <w:p>
+      <w:pPr>
+        <w:rPr>
+          <w:lang w:val="en-US"/>
+        </w:rPr>
+      </w:pPr>
+      <w:r>
+        <w:rPr>
+          <w:rFonts w:ascii="Consolas" w:eastAsia="Consolas" w:hAnsi="Consolas" w:cs="Consolas"/>
+          <w:sz w:val="18"/>
+          <w:szCs w:val="18"/>
+          <w:lang w:val="en-US"/>
+        </w:rPr>
+        <w:t xml:space="preserve"> </w:t>
+      </w:r>
+    </w:p>
+    <w:p>
+      <w:r>
+        <w:rPr>
+          <w:rFonts w:ascii="Consolas" w:eastAsia="Consolas" w:hAnsi="Consolas" w:cs="Consolas"/>
+          <w:sz w:val="18"/>
+          <w:szCs w:val="18"/>
+        </w:rPr>
+        <w:t>actor "Afiliado / Médico" as Cliente</w:t>
+      </w:r>
+    </w:p>
+    <w:p>
+      <w:r>
+        <w:rPr>
+          <w:rFonts w:ascii="Consolas" w:eastAsia="Consolas" w:hAnsi="Consolas" w:cs="Consolas"/>
+          <w:sz w:val="18"/>
+          <w:szCs w:val="18"/>
+        </w:rPr>
+        <w:t xml:space="preserve"> </w:t>
+      </w:r>
+    </w:p>
+    <w:p>
+      <w:proofErr w:type="spellStart"/>
+      <w:r>
+        <w:rPr>
+          <w:rFonts w:ascii="Consolas" w:eastAsia="Consolas" w:hAnsi="Consolas" w:cs="Consolas"/>
+          <w:sz w:val="18"/>
+          <w:szCs w:val="18"/>
+        </w:rPr>
+        <w:t>package</w:t>
+      </w:r>
+      <w:proofErr w:type="spellEnd"/>
+      <w:r>
+        <w:rPr>
+          <w:rFonts w:ascii="Consolas" w:eastAsia="Consolas" w:hAnsi="Consolas" w:cs="Consolas"/>
+          <w:sz w:val="18"/>
+          <w:szCs w:val="18"/>
+        </w:rPr>
+        <w:t xml:space="preserve"> "EPS - Arquitectura de Microservicios" {</w:t>
+      </w:r>
+    </w:p>
+    <w:p>
+      <w:pPr>
+        <w:rPr>
+          <w:lang w:val="en-US"/>
+        </w:rPr>
+      </w:pPr>
+      <w:r>
+        <w:rPr>
+          <w:rFonts w:ascii="Consolas" w:eastAsia="Consolas" w:hAnsi="Consolas" w:cs="Consolas"/>
+          <w:sz w:val="18"/>
+          <w:szCs w:val="18"/>
+        </w:rPr>
+        <w:t xml:space="preserve">  </w:t>
+      </w:r>
+      <w:r>
+        <w:rPr>
+          <w:rFonts w:ascii="Consolas" w:eastAsia="Consolas" w:hAnsi="Consolas" w:cs="Consolas"/>
+          <w:sz w:val="18"/>
+          <w:szCs w:val="18"/>
+          <w:lang w:val="en-US"/>
+        </w:rPr>
+        <w:t>[API Gateway] as GW</w:t>
+      </w:r>
+    </w:p>
+    <w:p>
+      <w:pPr>
+        <w:rPr>
+          <w:lang w:val="en-US"/>
+        </w:rPr>
+      </w:pPr>
+      <w:r>
+        <w:rPr>
+          <w:rFonts w:ascii="Consolas" w:eastAsia="Consolas" w:hAnsi="Consolas" w:cs="Consolas"/>
+          <w:sz w:val="18"/>
+          <w:szCs w:val="18"/>
+          <w:lang w:val="en-US"/>
+        </w:rPr>
+        <w:t xml:space="preserve"> </w:t>
+      </w:r>
+    </w:p>
+    <w:p>
+      <w:pPr>
+        <w:rPr>
+          <w:lang w:val="en-US"/>
+        </w:rPr>
+      </w:pPr>
+      <w:r>
+        <w:rPr>
+          <w:rFonts w:ascii="Consolas" w:eastAsia="Consolas" w:hAnsi="Consolas" w:cs="Consolas"/>
+          <w:sz w:val="18"/>
+          <w:szCs w:val="18"/>
+          <w:lang w:val="en-US"/>
+        </w:rPr>
+        <w:t xml:space="preserve">  component "</w:t>
+      </w:r>
+      <w:proofErr w:type="spellStart"/>
+      <w:r>
+        <w:rPr>
+          <w:rFonts w:ascii="Consolas" w:eastAsia="Consolas" w:hAnsi="Consolas" w:cs="Consolas"/>
+          <w:sz w:val="18"/>
+          <w:szCs w:val="18"/>
+          <w:lang w:val="en-US"/>
+        </w:rPr>
+        <w:t>ms-pacientes</w:t>
+      </w:r>
+      <w:proofErr w:type="spellEnd"/>
+      <w:r>
+        <w:rPr>
+          <w:rFonts w:ascii="Consolas" w:eastAsia="Consolas" w:hAnsi="Consolas" w:cs="Consolas"/>
+          <w:sz w:val="18"/>
+          <w:szCs w:val="18"/>
+          <w:lang w:val="en-US"/>
+        </w:rPr>
+        <w:t>" as Pac</w:t>
+      </w:r>
+    </w:p>
+    <w:p>
+      <w:pPr>
+        <w:rPr>
+          <w:lang w:val="en-US"/>
+        </w:rPr>
+      </w:pPr>
+      <w:r>
+        <w:rPr>
+          <w:rFonts w:ascii="Consolas" w:eastAsia="Consolas" w:hAnsi="Consolas" w:cs="Consolas"/>
+          <w:sz w:val="18"/>
+          <w:szCs w:val="18"/>
+          <w:lang w:val="en-US"/>
+        </w:rPr>
+        <w:t xml:space="preserve">  component "</w:t>
+      </w:r>
+      <w:proofErr w:type="spellStart"/>
+      <w:r>
+        <w:rPr>
+          <w:rFonts w:ascii="Consolas" w:eastAsia="Consolas" w:hAnsi="Consolas" w:cs="Consolas"/>
+          <w:sz w:val="18"/>
+          <w:szCs w:val="18"/>
+          <w:lang w:val="en-US"/>
+        </w:rPr>
+        <w:t>ms-citas</w:t>
+      </w:r>
+      <w:proofErr w:type="spellEnd"/>
+      <w:r>
+        <w:rPr>
+          <w:rFonts w:ascii="Consolas" w:eastAsia="Consolas" w:hAnsi="Consolas" w:cs="Consolas"/>
+          <w:sz w:val="18"/>
+          <w:szCs w:val="18"/>
+          <w:lang w:val="en-US"/>
+        </w:rPr>
+        <w:t>" as Cit</w:t>
+      </w:r>
+    </w:p>
+    <w:p>
+      <w:pPr>
+        <w:rPr>
+          <w:lang w:val="en-US"/>
+        </w:rPr>
+      </w:pPr>
+      <w:r>
+        <w:rPr>
+          <w:rFonts w:ascii="Consolas" w:eastAsia="Consolas" w:hAnsi="Consolas" w:cs="Consolas"/>
+          <w:sz w:val="18"/>
+          <w:szCs w:val="18"/>
+          <w:lang w:val="en-US"/>
+        </w:rPr>
+        <w:t xml:space="preserve">  component "</w:t>
+      </w:r>
+      <w:proofErr w:type="spellStart"/>
+      <w:r>
+        <w:rPr>
+          <w:rFonts w:ascii="Consolas" w:eastAsia="Consolas" w:hAnsi="Consolas" w:cs="Consolas"/>
+          <w:sz w:val="18"/>
+          <w:szCs w:val="18"/>
+          <w:lang w:val="en-US"/>
+        </w:rPr>
+        <w:t>ms-autorizaciones</w:t>
+      </w:r>
+      <w:proofErr w:type="spellEnd"/>
+      <w:r>
+        <w:rPr>
+          <w:rFonts w:ascii="Consolas" w:eastAsia="Consolas" w:hAnsi="Consolas" w:cs="Consolas"/>
+          <w:sz w:val="18"/>
+          <w:szCs w:val="18"/>
+          <w:lang w:val="en-US"/>
+        </w:rPr>
+        <w:t xml:space="preserve">" as </w:t>
+      </w:r>
+      <w:proofErr w:type="spellStart"/>
+      <w:r>
+        <w:rPr>
+          <w:rFonts w:ascii="Consolas" w:eastAsia="Consolas" w:hAnsi="Consolas" w:cs="Consolas"/>
+          <w:sz w:val="18"/>
+          <w:szCs w:val="18"/>
+          <w:lang w:val="en-US"/>
+        </w:rPr>
+        <w:t>Aut</w:t>
+      </w:r>
+      <w:proofErr w:type="spellEnd"/>
+    </w:p>
+    <w:p>
+      <w:pPr>
+        <w:rPr>
+          <w:lang w:val="en-US"/>
+        </w:rPr>
+      </w:pPr>
+      <w:r>
+        <w:rPr>
+          <w:rFonts w:ascii="Consolas" w:eastAsia="Consolas" w:hAnsi="Consolas" w:cs="Consolas"/>
+          <w:sz w:val="18"/>
+          <w:szCs w:val="18"/>
+          <w:lang w:val="en-US"/>
+        </w:rPr>
+        <w:t xml:space="preserve">  component "</w:t>
+      </w:r>
+      <w:proofErr w:type="spellStart"/>
+      <w:r>
+        <w:rPr>
+          <w:rFonts w:ascii="Consolas" w:eastAsia="Consolas" w:hAnsi="Consolas" w:cs="Consolas"/>
+          <w:sz w:val="18"/>
+          <w:szCs w:val="18"/>
+          <w:lang w:val="en-US"/>
+        </w:rPr>
+        <w:t>ms-facturacion</w:t>
+      </w:r>
+      <w:proofErr w:type="spellEnd"/>
+      <w:r>
+        <w:rPr>
+          <w:rFonts w:ascii="Consolas" w:eastAsia="Consolas" w:hAnsi="Consolas" w:cs="Consolas"/>
+          <w:sz w:val="18"/>
+          <w:szCs w:val="18"/>
+          <w:lang w:val="en-US"/>
+        </w:rPr>
+        <w:t>" as Fac</w:t>
+      </w:r>
+    </w:p>
+    <w:p>
+      <w:pPr>
+        <w:rPr>
+          <w:lang w:val="en-US"/>
+        </w:rPr>
+      </w:pPr>
+      <w:r>
+        <w:rPr>
+          <w:rFonts w:ascii="Consolas" w:eastAsia="Consolas" w:hAnsi="Consolas" w:cs="Consolas"/>
+          <w:sz w:val="18"/>
+          <w:szCs w:val="18"/>
+          <w:lang w:val="en-US"/>
+        </w:rPr>
+        <w:t xml:space="preserve">  component "</w:t>
+      </w:r>
+      <w:proofErr w:type="spellStart"/>
+      <w:r>
+        <w:rPr>
+          <w:rFonts w:ascii="Consolas" w:eastAsia="Consolas" w:hAnsi="Consolas" w:cs="Consolas"/>
+          <w:sz w:val="18"/>
+          <w:szCs w:val="18"/>
+          <w:lang w:val="en-US"/>
+        </w:rPr>
+        <w:t>ms-notificaciones</w:t>
+      </w:r>
+      <w:proofErr w:type="spellEnd"/>
+      <w:r>
+        <w:rPr>
+          <w:rFonts w:ascii="Consolas" w:eastAsia="Consolas" w:hAnsi="Consolas" w:cs="Consolas"/>
+          <w:sz w:val="18"/>
+          <w:szCs w:val="18"/>
+          <w:lang w:val="en-US"/>
+        </w:rPr>
+        <w:t>" as Not</w:t>
+      </w:r>
+    </w:p>
+    <w:p>
+      <w:pPr>
+        <w:rPr>
+          <w:lang w:val="en-US"/>
+        </w:rPr>
+      </w:pPr>
+      <w:r>
+        <w:rPr>
+          <w:rFonts w:ascii="Consolas" w:eastAsia="Consolas" w:hAnsi="Consolas" w:cs="Consolas"/>
+          <w:sz w:val="18"/>
+          <w:szCs w:val="18"/>
+          <w:lang w:val="en-US"/>
+        </w:rPr>
+        <w:t xml:space="preserve"> </w:t>
+      </w:r>
+    </w:p>
+    <w:p>
+      <w:pPr>
+        <w:rPr>
+          <w:lang w:val="en-US"/>
+        </w:rPr>
+      </w:pPr>
+      <w:r>
+        <w:rPr>
+          <w:rFonts w:ascii="Consolas" w:eastAsia="Consolas" w:hAnsi="Consolas" w:cs="Consolas"/>
+          <w:sz w:val="18"/>
+          <w:szCs w:val="18"/>
+          <w:lang w:val="en-US"/>
+        </w:rPr>
+        <w:t xml:space="preserve">  database "BD </w:t>
+      </w:r>
+      <w:proofErr w:type="spellStart"/>
+      <w:r>
+        <w:rPr>
+          <w:rFonts w:ascii="Consolas" w:eastAsia="Consolas" w:hAnsi="Consolas" w:cs="Consolas"/>
+          <w:sz w:val="18"/>
+          <w:szCs w:val="18"/>
+          <w:lang w:val="en-US"/>
+        </w:rPr>
+        <w:t>Pacientes</w:t>
+      </w:r>
+      <w:proofErr w:type="spellEnd"/>
+      <w:r>
+        <w:rPr>
+          <w:rFonts w:ascii="Consolas" w:eastAsia="Consolas" w:hAnsi="Consolas" w:cs="Consolas"/>
+          <w:sz w:val="18"/>
+          <w:szCs w:val="18"/>
+          <w:lang w:val="en-US"/>
+        </w:rPr>
+        <w:t xml:space="preserve">" as </w:t>
+      </w:r>
+      <w:proofErr w:type="spellStart"/>
+      <w:r>
+        <w:rPr>
+          <w:rFonts w:ascii="Consolas" w:eastAsia="Consolas" w:hAnsi="Consolas" w:cs="Consolas"/>
+          <w:sz w:val="18"/>
+          <w:szCs w:val="18"/>
+          <w:lang w:val="en-US"/>
+        </w:rPr>
+        <w:t>DBPac</w:t>
+      </w:r>
+      <w:proofErr w:type="spellEnd"/>
+    </w:p>
+    <w:p>
+      <w:r>
+        <w:rPr>
+          <w:rFonts w:ascii="Consolas" w:eastAsia="Consolas" w:hAnsi="Consolas" w:cs="Consolas"/>
+          <w:sz w:val="18"/>
+          <w:szCs w:val="18"/>
+          <w:lang w:val="en-US"/>
+        </w:rPr>
+        <w:t xml:space="preserve">  </w:t>
+      </w:r>
+      <w:proofErr w:type="spellStart"/>
+      <w:r>
+        <w:rPr>
+          <w:rFonts w:ascii="Consolas" w:eastAsia="Consolas" w:hAnsi="Consolas" w:cs="Consolas"/>
+          <w:sz w:val="18"/>
+          <w:szCs w:val="18"/>
+        </w:rPr>
+        <w:t>database</w:t>
+      </w:r>
+      <w:proofErr w:type="spellEnd"/>
+      <w:r>
+        <w:rPr>
+          <w:rFonts w:ascii="Consolas" w:eastAsia="Consolas" w:hAnsi="Consolas" w:cs="Consolas"/>
+          <w:sz w:val="18"/>
+          <w:szCs w:val="18"/>
+        </w:rPr>
+        <w:t xml:space="preserve"> "BD Citas" as </w:t>
+      </w:r>
+      <w:proofErr w:type="spellStart"/>
+      <w:r>
+        <w:rPr>
+          <w:rFonts w:ascii="Consolas" w:eastAsia="Consolas" w:hAnsi="Consolas" w:cs="Consolas"/>
+          <w:sz w:val="18"/>
+          <w:szCs w:val="18"/>
+        </w:rPr>
+        <w:t>DBCit</w:t>
+      </w:r>
+      <w:proofErr w:type="spellEnd"/>
+    </w:p>
+    <w:p>
+      <w:r>
+        <w:rPr>
+          <w:rFonts w:ascii="Consolas" w:eastAsia="Consolas" w:hAnsi="Consolas" w:cs="Consolas"/>
+          <w:sz w:val="18"/>
+          <w:szCs w:val="18"/>
+        </w:rPr>
+        <w:t xml:space="preserve">  </w:t>
+      </w:r>
+      <w:proofErr w:type="spellStart"/>
+      <w:r>
+        <w:rPr>
+          <w:rFonts w:ascii="Consolas" w:eastAsia="Consolas" w:hAnsi="Consolas" w:cs="Consolas"/>
+          <w:sz w:val="18"/>
+          <w:szCs w:val="18"/>
+        </w:rPr>
+        <w:t>database</w:t>
+      </w:r>
+      <w:proofErr w:type="spellEnd"/>
+      <w:r>
+        <w:rPr>
+          <w:rFonts w:ascii="Consolas" w:eastAsia="Consolas" w:hAnsi="Consolas" w:cs="Consolas"/>
+          <w:sz w:val="18"/>
+          <w:szCs w:val="18"/>
+        </w:rPr>
+        <w:t xml:space="preserve"> "BD Autorizaciones" as </w:t>
+      </w:r>
+      <w:proofErr w:type="spellStart"/>
+      <w:r>
+        <w:rPr>
+          <w:rFonts w:ascii="Consolas" w:eastAsia="Consolas" w:hAnsi="Consolas" w:cs="Consolas"/>
+          <w:sz w:val="18"/>
+          <w:szCs w:val="18"/>
+        </w:rPr>
+        <w:t>DBAut</w:t>
+      </w:r>
+      <w:proofErr w:type="spellEnd"/>
+    </w:p>
+    <w:p>
+      <w:pPr>
+        <w:rPr>
+          <w:lang w:val="en-US"/>
+        </w:rPr>
+      </w:pPr>
+      <w:r>
+        <w:rPr>
+          <w:rFonts w:ascii="Consolas" w:eastAsia="Consolas" w:hAnsi="Consolas" w:cs="Consolas"/>
+          <w:sz w:val="18"/>
+          <w:szCs w:val="18"/>
+        </w:rPr>
+        <w:t xml:space="preserve">  </w:t>
+      </w:r>
+      <w:r>
+        <w:rPr>
+          <w:rFonts w:ascii="Consolas" w:eastAsia="Consolas" w:hAnsi="Consolas" w:cs="Consolas"/>
+          <w:sz w:val="18"/>
+          <w:szCs w:val="18"/>
+          <w:lang w:val="en-US"/>
+        </w:rPr>
+        <w:t xml:space="preserve">database "BD </w:t>
+      </w:r>
+      <w:proofErr w:type="spellStart"/>
+      <w:r>
+        <w:rPr>
+          <w:rFonts w:ascii="Consolas" w:eastAsia="Consolas" w:hAnsi="Consolas" w:cs="Consolas"/>
+          <w:sz w:val="18"/>
+          <w:szCs w:val="18"/>
+          <w:lang w:val="en-US"/>
+        </w:rPr>
+        <w:t>Facturacion</w:t>
+      </w:r>
+      <w:proofErr w:type="spellEnd"/>
+      <w:r>
+        <w:rPr>
+          <w:rFonts w:ascii="Consolas" w:eastAsia="Consolas" w:hAnsi="Consolas" w:cs="Consolas"/>
+          <w:sz w:val="18"/>
+          <w:szCs w:val="18"/>
+          <w:lang w:val="en-US"/>
+        </w:rPr>
+        <w:t xml:space="preserve">" as </w:t>
+      </w:r>
+      <w:proofErr w:type="spellStart"/>
+      <w:r>
+        <w:rPr>
+          <w:rFonts w:ascii="Consolas" w:eastAsia="Consolas" w:hAnsi="Consolas" w:cs="Consolas"/>
+          <w:sz w:val="18"/>
+          <w:szCs w:val="18"/>
+          <w:lang w:val="en-US"/>
+        </w:rPr>
+        <w:t>DBFac</w:t>
+      </w:r>
+      <w:proofErr w:type="spellEnd"/>
+    </w:p>
+    <w:p>
+      <w:pPr>
+        <w:rPr>
+          <w:lang w:val="en-US"/>
+        </w:rPr>
+      </w:pPr>
+      <w:r>
+        <w:rPr>
+          <w:rFonts w:ascii="Consolas" w:eastAsia="Consolas" w:hAnsi="Consolas" w:cs="Consolas"/>
+          <w:sz w:val="18"/>
+          <w:szCs w:val="18"/>
+          <w:lang w:val="en-US"/>
+        </w:rPr>
+        <w:t xml:space="preserve"> </w:t>
+      </w:r>
+    </w:p>
+    <w:p>
+      <w:pPr>
+        <w:rPr>
+          <w:lang w:val="en-US"/>
+        </w:rPr>
+      </w:pPr>
+      <w:r>
+        <w:rPr>
+          <w:rFonts w:ascii="Consolas" w:eastAsia="Consolas" w:hAnsi="Consolas" w:cs="Consolas"/>
+          <w:sz w:val="18"/>
+          <w:szCs w:val="18"/>
+          <w:lang w:val="en-US"/>
+        </w:rPr>
+        <w:t xml:space="preserve">  queue "Message Broker" as MQ</w:t>
+      </w:r>
+    </w:p>
+    <w:p>
+      <w:pPr>
+        <w:rPr>
+          <w:lang w:val="en-US"/>
+        </w:rPr>
+      </w:pPr>
+      <w:r>
+        <w:rPr>
+          <w:rFonts w:ascii="Consolas" w:eastAsia="Consolas" w:hAnsi="Consolas" w:cs="Consolas"/>
+          <w:sz w:val="18"/>
+          <w:szCs w:val="18"/>
+          <w:lang w:val="en-US"/>
+        </w:rPr>
+        <w:t>}</w:t>
+      </w:r>
+    </w:p>
+    <w:p>
+      <w:pPr>
+        <w:rPr>
+          <w:lang w:val="en-US"/>
+        </w:rPr>
+      </w:pPr>
+      <w:r>
+        <w:rPr>
+          <w:rFonts w:ascii="Consolas" w:eastAsia="Consolas" w:hAnsi="Consolas" w:cs="Consolas"/>
+          <w:sz w:val="18"/>
+          <w:szCs w:val="18"/>
+          <w:lang w:val="en-US"/>
+        </w:rPr>
+        <w:t xml:space="preserve"> </w:t>
+      </w:r>
+    </w:p>
+    <w:p>
+      <w:pPr>
+        <w:rPr>
+          <w:lang w:val="en-US"/>
+        </w:rPr>
+      </w:pPr>
+      <w:proofErr w:type="spellStart"/>
+      <w:r>
+        <w:rPr>
+          <w:rFonts w:ascii="Consolas" w:eastAsia="Consolas" w:hAnsi="Consolas" w:cs="Consolas"/>
+          <w:sz w:val="18"/>
+          <w:szCs w:val="18"/>
+          <w:lang w:val="en-US"/>
+        </w:rPr>
+        <w:t>Cliente</w:t>
+      </w:r>
+      <w:proofErr w:type="spellEnd"/>
+      <w:r>
+        <w:rPr>
+          <w:rFonts w:ascii="Consolas" w:eastAsia="Consolas" w:hAnsi="Consolas" w:cs="Consolas"/>
+          <w:sz w:val="18"/>
+          <w:szCs w:val="18"/>
+          <w:lang w:val="en-US"/>
+        </w:rPr>
+        <w:t xml:space="preserve"> --&gt; GW : HTTPS / REST</w:t>
+      </w:r>
+    </w:p>
+    <w:p>
+      <w:pPr>
+        <w:rPr>
+          <w:lang w:val="en-US"/>
+        </w:rPr>
+      </w:pPr>
+      <w:r>
+        <w:rPr>
+          <w:rFonts w:ascii="Consolas" w:eastAsia="Consolas" w:hAnsi="Consolas" w:cs="Consolas"/>
+          <w:sz w:val="18"/>
+          <w:szCs w:val="18"/>
+          <w:lang w:val="en-US"/>
+        </w:rPr>
+        <w:t>GW --&gt; Pac</w:t>
+      </w:r>
+    </w:p>
+    <w:p>
+      <w:pPr>
+        <w:rPr>
+          <w:lang w:val="en-US"/>
+        </w:rPr>
+      </w:pPr>
+      <w:r>
+        <w:rPr>
+          <w:rFonts w:ascii="Consolas" w:eastAsia="Consolas" w:hAnsi="Consolas" w:cs="Consolas"/>
+          <w:sz w:val="18"/>
+          <w:szCs w:val="18"/>
+          <w:lang w:val="en-US"/>
+        </w:rPr>
+        <w:t>GW --&gt; Cit</w:t>
+      </w:r>
+    </w:p>
+    <w:p>
+      <w:pPr>
+        <w:rPr>
+          <w:lang w:val="en-US"/>
+        </w:rPr>
+      </w:pPr>
+      <w:r>
+        <w:rPr>
+          <w:rFonts w:ascii="Consolas" w:eastAsia="Consolas" w:hAnsi="Consolas" w:cs="Consolas"/>
+          <w:sz w:val="18"/>
+          <w:szCs w:val="18"/>
+          <w:lang w:val="en-US"/>
+        </w:rPr>
+        <w:t xml:space="preserve">GW --&gt; </w:t>
+      </w:r>
+      <w:proofErr w:type="spellStart"/>
+      <w:r>
+        <w:rPr>
+          <w:rFonts w:ascii="Consolas" w:eastAsia="Consolas" w:hAnsi="Consolas" w:cs="Consolas"/>
+          <w:sz w:val="18"/>
+          <w:szCs w:val="18"/>
+          <w:lang w:val="en-US"/>
+        </w:rPr>
+        <w:t>Aut</w:t>
+      </w:r>
+      <w:proofErr w:type="spellEnd"/>
+    </w:p>
+    <w:p>
+      <w:pPr>
+        <w:rPr>
+          <w:lang w:val="en-US"/>
+        </w:rPr>
+      </w:pPr>
+      <w:r>
+        <w:rPr>
+          <w:rFonts w:ascii="Consolas" w:eastAsia="Consolas" w:hAnsi="Consolas" w:cs="Consolas"/>
+          <w:sz w:val="18"/>
+          <w:szCs w:val="18"/>
+          <w:lang w:val="en-US"/>
+        </w:rPr>
+        <w:t>GW --&gt; Fac</w:t>
+      </w:r>
+    </w:p>
+    <w:p>
+      <w:pPr>
+        <w:rPr>
+          <w:lang w:val="en-US"/>
+        </w:rPr>
+      </w:pPr>
+      <w:r>
+        <w:rPr>
+          <w:rFonts w:ascii="Consolas" w:eastAsia="Consolas" w:hAnsi="Consolas" w:cs="Consolas"/>
+          <w:sz w:val="18"/>
+          <w:szCs w:val="18"/>
+          <w:lang w:val="en-US"/>
+        </w:rPr>
+        <w:t xml:space="preserve"> </w:t>
+      </w:r>
+    </w:p>
+    <w:p>
+      <w:pPr>
+        <w:rPr>
+          <w:lang w:val="en-US"/>
+        </w:rPr>
+      </w:pPr>
+      <w:r>
+        <w:rPr>
+          <w:rFonts w:ascii="Consolas" w:eastAsia="Consolas" w:hAnsi="Consolas" w:cs="Consolas"/>
+          <w:sz w:val="18"/>
+          <w:szCs w:val="18"/>
+          <w:lang w:val="en-US"/>
+        </w:rPr>
+        <w:t xml:space="preserve">Pac --&gt; </w:t>
+      </w:r>
+      <w:proofErr w:type="spellStart"/>
+      <w:r>
+        <w:rPr>
+          <w:rFonts w:ascii="Consolas" w:eastAsia="Consolas" w:hAnsi="Consolas" w:cs="Consolas"/>
+          <w:sz w:val="18"/>
+          <w:szCs w:val="18"/>
+          <w:lang w:val="en-US"/>
+        </w:rPr>
+        <w:t>DBPac</w:t>
+      </w:r>
+      <w:proofErr w:type="spellEnd"/>
+    </w:p>
+    <w:p>
+      <w:pPr>
+        <w:rPr>
+          <w:lang w:val="en-US"/>
+        </w:rPr>
+      </w:pPr>
+      <w:r>
+        <w:rPr>
+          <w:rFonts w:ascii="Consolas" w:eastAsia="Consolas" w:hAnsi="Consolas" w:cs="Consolas"/>
+          <w:sz w:val="18"/>
+          <w:szCs w:val="18"/>
+          <w:lang w:val="en-US"/>
+        </w:rPr>
+        <w:t xml:space="preserve">Cit --&gt; </w:t>
+      </w:r>
+      <w:proofErr w:type="spellStart"/>
+      <w:r>
+        <w:rPr>
+          <w:rFonts w:ascii="Consolas" w:eastAsia="Consolas" w:hAnsi="Consolas" w:cs="Consolas"/>
+          <w:sz w:val="18"/>
+          <w:szCs w:val="18"/>
+          <w:lang w:val="en-US"/>
+        </w:rPr>
+        <w:t>DBCit</w:t>
+      </w:r>
+      <w:proofErr w:type="spellEnd"/>
+    </w:p>
+    <w:p>
+      <w:pPr>
+        <w:rPr>
+          <w:lang w:val="en-US"/>
+        </w:rPr>
+      </w:pPr>
+      <w:proofErr w:type="spellStart"/>
+      <w:r>
+        <w:rPr>
+          <w:rFonts w:ascii="Consolas" w:eastAsia="Consolas" w:hAnsi="Consolas" w:cs="Consolas"/>
+          <w:sz w:val="18"/>
+          <w:szCs w:val="18"/>
+          <w:lang w:val="en-US"/>
+        </w:rPr>
+        <w:t>Aut</w:t>
+      </w:r>
+      <w:proofErr w:type="spellEnd"/>
+      <w:r>
+        <w:rPr>
+          <w:rFonts w:ascii="Consolas" w:eastAsia="Consolas" w:hAnsi="Consolas" w:cs="Consolas"/>
+          <w:sz w:val="18"/>
+          <w:szCs w:val="18"/>
+          <w:lang w:val="en-US"/>
+        </w:rPr>
+        <w:t xml:space="preserve"> --&gt; </w:t>
+      </w:r>
+      <w:proofErr w:type="spellStart"/>
+      <w:r>
+        <w:rPr>
+          <w:rFonts w:ascii="Consolas" w:eastAsia="Consolas" w:hAnsi="Consolas" w:cs="Consolas"/>
+          <w:sz w:val="18"/>
+          <w:szCs w:val="18"/>
+          <w:lang w:val="en-US"/>
+        </w:rPr>
+        <w:t>DBAut</w:t>
+      </w:r>
+      <w:proofErr w:type="spellEnd"/>
+    </w:p>
+    <w:p>
+      <w:proofErr w:type="spellStart"/>
+      <w:r>
+        <w:rPr>
+          <w:rFonts w:ascii="Consolas" w:eastAsia="Consolas" w:hAnsi="Consolas" w:cs="Consolas"/>
+          <w:sz w:val="18"/>
+          <w:szCs w:val="18"/>
+        </w:rPr>
+        <w:t>Fac</w:t>
+      </w:r>
+      <w:proofErr w:type="spellEnd"/>
+      <w:r>
+        <w:rPr>
+          <w:rFonts w:ascii="Consolas" w:eastAsia="Consolas" w:hAnsi="Consolas" w:cs="Consolas"/>
+          <w:sz w:val="18"/>
+          <w:szCs w:val="18"/>
+        </w:rPr>
+        <w:t xml:space="preserve"> --&gt; </w:t>
+      </w:r>
+      <w:proofErr w:type="spellStart"/>
+      <w:r>
+        <w:rPr>
+          <w:rFonts w:ascii="Consolas" w:eastAsia="Consolas" w:hAnsi="Consolas" w:cs="Consolas"/>
+          <w:sz w:val="18"/>
+          <w:szCs w:val="18"/>
+        </w:rPr>
+        <w:t>DBFac</w:t>
+      </w:r>
+      <w:proofErr w:type="spellEnd"/>
+    </w:p>
+    <w:p>
+      <w:r>
+        <w:rPr>
+          <w:rFonts w:ascii="Consolas" w:eastAsia="Consolas" w:hAnsi="Consolas" w:cs="Consolas"/>
+          <w:sz w:val="18"/>
+          <w:szCs w:val="18"/>
+        </w:rPr>
+        <w:t xml:space="preserve"> </w:t>
+      </w:r>
+    </w:p>
+    <w:p>
+      <w:proofErr w:type="spellStart"/>
+      <w:r>
+        <w:rPr>
+          <w:rFonts w:ascii="Consolas" w:eastAsia="Consolas" w:hAnsi="Consolas" w:cs="Consolas"/>
+          <w:sz w:val="18"/>
+          <w:szCs w:val="18"/>
+        </w:rPr>
+        <w:t>Cit</w:t>
+      </w:r>
+      <w:proofErr w:type="spellEnd"/>
+      <w:proofErr w:type="gramStart"/>
+      <w:r>
+        <w:rPr>
+          <w:rFonts w:ascii="Consolas" w:eastAsia="Consolas" w:hAnsi="Consolas" w:cs="Consolas"/>
+          <w:sz w:val="18"/>
+          <w:szCs w:val="18"/>
+        </w:rPr>
+        <w:t xml:space="preserve"> ..</w:t>
+      </w:r>
+      <w:proofErr w:type="gramEnd"/>
+      <w:r>
+        <w:rPr>
+          <w:rFonts w:ascii="Consolas" w:eastAsia="Consolas" w:hAnsi="Consolas" w:cs="Consolas"/>
+          <w:sz w:val="18"/>
+          <w:szCs w:val="18"/>
+        </w:rPr>
+        <w:t>&gt; Aut : valida cobertura</w:t>
+      </w:r>
+    </w:p>
+    <w:p>
+      <w:r>
+        <w:rPr>
+          <w:rFonts w:ascii="Consolas" w:eastAsia="Consolas" w:hAnsi="Consolas" w:cs="Consolas"/>
+          <w:sz w:val="18"/>
+          <w:szCs w:val="18"/>
+        </w:rPr>
+        <w:t>Aut</w:t>
+      </w:r>
+      <w:proofErr w:type="gramStart"/>
+      <w:r>
+        <w:rPr>
+          <w:rFonts w:ascii="Consolas" w:eastAsia="Consolas" w:hAnsi="Consolas" w:cs="Consolas"/>
+          <w:sz w:val="18"/>
+          <w:szCs w:val="18"/>
+        </w:rPr>
+        <w:t xml:space="preserve"> ..</w:t>
+      </w:r>
+      <w:proofErr w:type="gramEnd"/>
+      <w:r>
+        <w:rPr>
+          <w:rFonts w:ascii="Consolas" w:eastAsia="Consolas" w:hAnsi="Consolas" w:cs="Consolas"/>
+          <w:sz w:val="18"/>
+          <w:szCs w:val="18"/>
+        </w:rPr>
+        <w:t xml:space="preserve">&gt; </w:t>
+      </w:r>
+      <w:proofErr w:type="spellStart"/>
+      <w:r>
+        <w:rPr>
+          <w:rFonts w:ascii="Consolas" w:eastAsia="Consolas" w:hAnsi="Consolas" w:cs="Consolas"/>
+          <w:sz w:val="18"/>
+          <w:szCs w:val="18"/>
+        </w:rPr>
+        <w:t>Fac</w:t>
+      </w:r>
+      <w:proofErr w:type="spellEnd"/>
+      <w:r>
+        <w:rPr>
+          <w:rFonts w:ascii="Consolas" w:eastAsia="Consolas" w:hAnsi="Consolas" w:cs="Consolas"/>
+          <w:sz w:val="18"/>
+          <w:szCs w:val="18"/>
+        </w:rPr>
+        <w:t xml:space="preserve"> : genera cargo</w:t>
+      </w:r>
+    </w:p>
+    <w:p>
+      <w:r>
+        <w:rPr>
+          <w:rFonts w:ascii="Consolas" w:eastAsia="Consolas" w:hAnsi="Consolas" w:cs="Consolas"/>
+          <w:sz w:val="18"/>
+          <w:szCs w:val="18"/>
+        </w:rPr>
+        <w:t xml:space="preserve"> </w:t>
+      </w:r>
+    </w:p>
+    <w:p>
+      <w:proofErr w:type="spellStart"/>
+      <w:r>
+        <w:rPr>
+          <w:rFonts w:ascii="Consolas" w:eastAsia="Consolas" w:hAnsi="Consolas" w:cs="Consolas"/>
+          <w:sz w:val="18"/>
+          <w:szCs w:val="18"/>
+        </w:rPr>
+        <w:t>Cit</w:t>
+      </w:r>
+      <w:proofErr w:type="spellEnd"/>
+      <w:r>
+        <w:rPr>
+          <w:rFonts w:ascii="Consolas" w:eastAsia="Consolas" w:hAnsi="Consolas" w:cs="Consolas"/>
+          <w:sz w:val="18"/>
+          <w:szCs w:val="18"/>
+        </w:rPr>
+        <w:t xml:space="preserve"> --&gt; MQ : publica </w:t>
+      </w:r>
+      <w:proofErr w:type="spellStart"/>
+      <w:r>
+        <w:rPr>
+          <w:rFonts w:ascii="Consolas" w:eastAsia="Consolas" w:hAnsi="Consolas" w:cs="Consolas"/>
+          <w:sz w:val="18"/>
+          <w:szCs w:val="18"/>
+        </w:rPr>
+        <w:t>cita_creada</w:t>
+      </w:r>
+      <w:proofErr w:type="spellEnd"/>
+    </w:p>
+    <w:p>
+      <w:r>
+        <w:rPr>
+          <w:rFonts w:ascii="Consolas" w:eastAsia="Consolas" w:hAnsi="Consolas" w:cs="Consolas"/>
+          <w:sz w:val="18"/>
+          <w:szCs w:val="18"/>
+        </w:rPr>
+        <w:t xml:space="preserve">Aut --&gt; MQ : publica </w:t>
+      </w:r>
+      <w:proofErr w:type="spellStart"/>
+      <w:r>
+        <w:rPr>
+          <w:rFonts w:ascii="Consolas" w:eastAsia="Consolas" w:hAnsi="Consolas" w:cs="Consolas"/>
+          <w:sz w:val="18"/>
+          <w:szCs w:val="18"/>
+        </w:rPr>
+        <w:t>autorizacion_emitida</w:t>
+      </w:r>
+      <w:proofErr w:type="spellEnd"/>
+    </w:p>
+    <w:p>
+      <w:proofErr w:type="spellStart"/>
+      <w:r>
+        <w:rPr>
+          <w:rFonts w:ascii="Consolas" w:eastAsia="Consolas" w:hAnsi="Consolas" w:cs="Consolas"/>
+          <w:sz w:val="18"/>
+          <w:szCs w:val="18"/>
+        </w:rPr>
+        <w:t>Fac</w:t>
+      </w:r>
+      <w:proofErr w:type="spellEnd"/>
+      <w:r>
+        <w:rPr>
+          <w:rFonts w:ascii="Consolas" w:eastAsia="Consolas" w:hAnsi="Consolas" w:cs="Consolas"/>
+          <w:sz w:val="18"/>
+          <w:szCs w:val="18"/>
+        </w:rPr>
+        <w:t xml:space="preserve"> --&gt; MQ : publica </w:t>
+      </w:r>
+      <w:proofErr w:type="spellStart"/>
+      <w:r>
+        <w:rPr>
+          <w:rFonts w:ascii="Consolas" w:eastAsia="Consolas" w:hAnsi="Consolas" w:cs="Consolas"/>
+          <w:sz w:val="18"/>
+          <w:szCs w:val="18"/>
+        </w:rPr>
+        <w:t>pago_confirmado</w:t>
+      </w:r>
+      <w:proofErr w:type="spellEnd"/>
+    </w:p>
+    <w:p>
+      <w:r>
+        <w:rPr>
+          <w:rFonts w:ascii="Consolas" w:eastAsia="Consolas" w:hAnsi="Consolas" w:cs="Consolas"/>
+          <w:sz w:val="18"/>
+          <w:szCs w:val="18"/>
+        </w:rPr>
+        <w:t>MQ --&gt; Not : consume eventos</w:t>
+      </w:r>
+    </w:p>
+    <w:p>
+      <w:r>
+        <w:rPr>
+          <w:rFonts w:ascii="Consolas" w:eastAsia="Consolas" w:hAnsi="Consolas" w:cs="Consolas"/>
+          <w:sz w:val="18"/>
+          <w:szCs w:val="18"/>
+        </w:rPr>
+        <w:t xml:space="preserve"> </w:t>
+      </w:r>
+    </w:p>
+    <w:p>
+      <w:r>
+        <w:rPr>
+          <w:rFonts w:ascii="Consolas" w:eastAsia="Consolas" w:hAnsi="Consolas" w:cs="Consolas"/>
+          <w:sz w:val="18"/>
+          <w:szCs w:val="18"/>
+        </w:rPr>
+        <w:t>@enduml</w:t>
+      </w:r>
+    </w:p>
+    <w:p>
+      <w:r>
+        <w:rPr>
+          <w:rFonts w:ascii="Consolas" w:eastAsia="Consolas" w:hAnsi="Consolas" w:cs="Consolas"/>
+          <w:sz w:val="18"/>
+          <w:szCs w:val="18"/>
+        </w:rPr>
+        <w:t xml:space="preserve"> </w:t>
+      </w:r>
+    </w:p>
     <w:p/>
     <w:sectPr>
-      <w:pgSz w:w="12240" w:h="15840" w:code="1"/>
-      <w:pgMar w:top="1440" w:right="1440" w:bottom="1440" w:left="1440" w:header="709" w:footer="709" w:gutter="0"/>
-      <w:cols w:space="708"/>
+      <w:pgSz w:w="12240" w:h="15840"/>
+      <w:pgMar w:top="1440" w:right="1440" w:bottom="1440" w:left="1440" w:header="708" w:footer="708" w:gutter="0"/>
+      <w:cols w:space="720"/>
       <w:docGrid w:linePitch="360"/>
     </w:sectPr>
   </w:body>
@@ -16,6 +1912,92 @@
 <file path=word/numbering.xml><?xml version="1.0" encoding="utf-8"?>
 <w:numbering xmlns:wpc="http://schemas.microsoft.com/office/word/2010/wordprocessingCanvas" xmlns:cx="http://schemas.microsoft.com/office/drawing/2014/chartex" xmlns:cx1="http://schemas.microsoft.com/office/drawing/2015/9/8/chartex" xmlns:cx2="http://schemas.microsoft.com/office/drawing/2015/10/21/chartex" xmlns:cx3="http://schemas.microsoft.com/office/drawing/2016/5/9/chartex" xmlns:cx4="http://schemas.microsoft.com/office/drawing/2016/5/10/chartex" xmlns:cx5="http://schemas.microsoft.com/office/drawing/2016/5/11/chartex" xmlns:cx6="http://schemas.microsoft.com/office/drawing/2016/5/12/chartex" xmlns:cx7="http://schemas.microsoft.com/office/drawing/2016/5/13/chartex" xmlns:cx8="http://schemas.microsoft.com/office/drawing/2016/5/14/chartex" xmlns:mc="http://schemas.openxmlformats.org/markup-compatibility/2006" xmlns:aink="http://schemas.microsoft.com/office/drawing/2016/ink" xmlns:am3d="http://schemas.microsoft.com/office/drawing/2017/model3d" xmlns:o="urn:schemas-microsoft-com:office:office" xmlns:oel="http://schemas.microsoft.com/office/2019/extlst" xmlns:r="http://schemas.openxmlformats.org/officeDocument/2006/relationships" xmlns:m="http://schemas.openxmlformats.org/officeDocument/2006/math" xmlns:v="urn:schemas-microsoft-com:vml" xmlns:wp14="http://schemas.microsoft.com/office/word/2010/wordprocessingDrawing" xmlns:wp="http://schemas.openxmlformats.org/drawingml/2006/wordprocessingDrawing" xmlns:w10="urn:schemas-microsoft-com:office:word" xmlns:w="http://schemas.openxmlformats.org/wordprocessingml/2006/main" xmlns:w14="http://schemas.microsoft.com/office/word/2010/wordml" xmlns:w15="http://schemas.microsoft.com/office/word/2012/wordml" xmlns:w16cex="http://schemas.microsoft.com/office/word/2018/wordml/cex" xmlns:w16cid="http://schemas.microsoft.com/office/word/2016/wordml/cid" xmlns:w16="http://schemas.microsoft.com/office/word/2018/wordml" xmlns:w16du="http://schemas.microsoft.com/office/word/2023/wordml/word16du" xmlns:w16sdtdh="http://schemas.microsoft.com/office/word/2020/wordml/sdtdatahash" xmlns:w16sdtfl="http://schemas.microsoft.com/office/word/2024/wordml/sdtformatlock" xmlns:w16se="http://schemas.microsoft.com/office/word/2015/wordml/symex" xmlns:wpg="http://schemas.microsoft.com/office/word/2010/wordprocessingGroup" xmlns:wpi="http://schemas.microsoft.com/office/word/2010/wordprocessingInk" xmlns:wne="http://schemas.microsoft.com/office/word/2006/wordml" xmlns:wps="http://schemas.microsoft.com/office/word/2010/wordprocessingShape" mc:Ignorable="w14 w15 w16se w16cid w16 w16cex w16sdtdh w16sdtfl w16du wp14">
   <w:abstractNum w:abstractNumId="0" w15:restartNumberingAfterBreak="0">
+    <w:nsid w:val="1ADB74FE"/>
+    <w:multiLevelType w:val="hybridMultilevel"/>
+    <w:tmpl w:val="E5C68116"/>
+    <w:lvl w:ilvl="0" w:tplc="B94E8D90">
+      <w:start w:val="1"/>
+      <w:numFmt w:val="bullet"/>
+      <w:lvlText w:val="●"/>
+      <w:lvlJc w:val="left"/>
+      <w:pPr>
+        <w:ind w:left="720" w:hanging="360"/>
+      </w:pPr>
+    </w:lvl>
+    <w:lvl w:ilvl="1" w:tplc="74C4FA60">
+      <w:start w:val="1"/>
+      <w:numFmt w:val="bullet"/>
+      <w:lvlText w:val="○"/>
+      <w:lvlJc w:val="left"/>
+      <w:pPr>
+        <w:ind w:left="1440" w:hanging="360"/>
+      </w:pPr>
+    </w:lvl>
+    <w:lvl w:ilvl="2" w:tplc="FF4223A8">
+      <w:start w:val="1"/>
+      <w:numFmt w:val="bullet"/>
+      <w:lvlText w:val="■"/>
+      <w:lvlJc w:val="left"/>
+      <w:pPr>
+        <w:ind w:left="2160" w:hanging="360"/>
+      </w:pPr>
+    </w:lvl>
+    <w:lvl w:ilvl="3" w:tplc="60483D96">
+      <w:start w:val="1"/>
+      <w:numFmt w:val="bullet"/>
+      <w:lvlText w:val="●"/>
+      <w:lvlJc w:val="left"/>
+      <w:pPr>
+        <w:ind w:left="2880" w:hanging="360"/>
+      </w:pPr>
+    </w:lvl>
+    <w:lvl w:ilvl="4" w:tplc="17149928">
+      <w:start w:val="1"/>
+      <w:numFmt w:val="bullet"/>
+      <w:lvlText w:val="○"/>
+      <w:lvlJc w:val="left"/>
+      <w:pPr>
+        <w:ind w:left="3600" w:hanging="360"/>
+      </w:pPr>
+    </w:lvl>
+    <w:lvl w:ilvl="5" w:tplc="42FE67BC">
+      <w:start w:val="1"/>
+      <w:numFmt w:val="bullet"/>
+      <w:lvlText w:val="■"/>
+      <w:lvlJc w:val="left"/>
+      <w:pPr>
+        <w:ind w:left="4320" w:hanging="360"/>
+      </w:pPr>
+    </w:lvl>
+    <w:lvl w:ilvl="6" w:tplc="FCAA9106">
+      <w:start w:val="1"/>
+      <w:numFmt w:val="bullet"/>
+      <w:lvlText w:val="●"/>
+      <w:lvlJc w:val="left"/>
+      <w:pPr>
+        <w:ind w:left="5040" w:hanging="360"/>
+      </w:pPr>
+    </w:lvl>
+    <w:lvl w:ilvl="7" w:tplc="FD16CACA">
+      <w:start w:val="1"/>
+      <w:numFmt w:val="bullet"/>
+      <w:lvlText w:val="●"/>
+      <w:lvlJc w:val="left"/>
+      <w:pPr>
+        <w:ind w:left="5760" w:hanging="360"/>
+      </w:pPr>
+    </w:lvl>
+    <w:lvl w:ilvl="8" w:tplc="47BED0EC">
+      <w:start w:val="1"/>
+      <w:numFmt w:val="bullet"/>
+      <w:lvlText w:val="●"/>
+      <w:lvlJc w:val="left"/>
+      <w:pPr>
+        <w:ind w:left="6480" w:hanging="360"/>
+      </w:pPr>
+    </w:lvl>
+  </w:abstractNum>
+  <w:abstractNum w:abstractNumId="1" w15:restartNumberingAfterBreak="0">
     <w:nsid w:val="2D100AAA"/>
     <w:multiLevelType w:val="multilevel"/>
     <w:tmpl w:val="BDF8781A"/>
@@ -128,7 +2110,7 @@
       </w:pPr>
     </w:lvl>
   </w:abstractNum>
-  <w:abstractNum w:abstractNumId="1" w15:restartNumberingAfterBreak="0">
+  <w:abstractNum w:abstractNumId="2" w15:restartNumberingAfterBreak="0">
     <w:nsid w:val="7DF747B9"/>
     <w:multiLevelType w:val="hybridMultilevel"/>
     <w:tmpl w:val="D1589EC0"/>
@@ -215,10 +2197,16 @@
     </w:lvl>
   </w:abstractNum>
   <w:num w:numId="1" w16cid:durableId="1981301816">
+    <w:abstractNumId w:val="2"/>
+  </w:num>
+  <w:num w:numId="2" w16cid:durableId="247464035">
     <w:abstractNumId w:val="1"/>
   </w:num>
-  <w:num w:numId="2" w16cid:durableId="247464035">
+  <w:num w:numId="3" w16cid:durableId="461386514">
     <w:abstractNumId w:val="0"/>
+    <w:lvlOverride w:ilvl="0">
+      <w:startOverride w:val="1"/>
+    </w:lvlOverride>
   </w:num>
 </w:numbering>
 </file>
@@ -422,7 +2410,7 @@
     <w:lsdException w:name="Medium Shading 2 Accent 1" w:uiPriority="64"/>
     <w:lsdException w:name="Medium List 1 Accent 1" w:uiPriority="65"/>
     <w:lsdException w:name="Revision" w:semiHidden="1"/>
-    <w:lsdException w:name="List Paragraph" w:uiPriority="34" w:qFormat="1"/>
+    <w:lsdException w:name="List Paragraph" w:uiPriority="0" w:qFormat="1"/>
     <w:lsdException w:name="Quote" w:uiPriority="29" w:qFormat="1"/>
     <w:lsdException w:name="Intense Quote" w:uiPriority="30" w:qFormat="1"/>
     <w:lsdException w:name="Medium List 2 Accent 1" w:uiPriority="66"/>
@@ -623,9 +2611,17 @@
   <w:style w:type="paragraph" w:default="1" w:styleId="Normal">
     <w:name w:val="Normal"/>
     <w:qFormat/>
-    <w:rsid w:val="005C03C9"/>
+    <w:rsid w:val="004D577D"/>
+    <w:pPr>
+      <w:spacing w:after="0" w:line="240" w:lineRule="auto"/>
+    </w:pPr>
     <w:rPr>
-      <w:rFonts w:ascii="Times New Roman" w:hAnsi="Times New Roman"/>
+      <w:rFonts w:ascii="Times New Roman" w:eastAsia="Times New Roman" w:hAnsi="Times New Roman" w:cs="Times New Roman"/>
+      <w:kern w:val="0"/>
+      <w:sz w:val="20"/>
+      <w:szCs w:val="20"/>
+      <w:lang w:eastAsia="es-CO"/>
+      <w14:ligatures w14:val="none"/>
     </w:rPr>
   </w:style>
   <w:style w:type="paragraph" w:styleId="Ttulo1">
@@ -638,16 +2634,14 @@
     <w:qFormat/>
     <w:rsid w:val="009265EA"/>
     <w:pPr>
-      <w:spacing w:after="0" w:line="360" w:lineRule="auto"/>
+      <w:spacing w:line="360" w:lineRule="auto"/>
       <w:ind w:firstLine="708"/>
       <w:jc w:val="center"/>
       <w:outlineLvl w:val="0"/>
     </w:pPr>
     <w:rPr>
-      <w:rFonts w:eastAsia="Calibri" w:cs="Times New Roman"/>
+      <w:rFonts w:eastAsia="Calibri"/>
       <w:b/>
-      <w:kern w:val="0"/>
-      <w14:ligatures w14:val="none"/>
     </w:rPr>
   </w:style>
   <w:style w:type="paragraph" w:styleId="Ttulo2">
@@ -685,11 +2679,9 @@
       <w:outlineLvl w:val="2"/>
     </w:pPr>
     <w:rPr>
-      <w:rFonts w:eastAsia="Calibri" w:cs="Times New Roman"/>
+      <w:rFonts w:eastAsia="Calibri"/>
       <w:b/>
-      <w:kern w:val="0"/>
       <w:szCs w:val="22"/>
-      <w14:ligatures w14:val="none"/>
     </w:rPr>
   </w:style>
   <w:style w:type="paragraph" w:styleId="Ttulo4">
@@ -749,7 +2741,7 @@
     <w:pPr>
       <w:keepNext/>
       <w:keepLines/>
-      <w:spacing w:before="40" w:after="0"/>
+      <w:spacing w:before="40"/>
       <w:outlineLvl w:val="5"/>
     </w:pPr>
     <w:rPr>
@@ -772,7 +2764,7 @@
     <w:pPr>
       <w:keepNext/>
       <w:keepLines/>
-      <w:spacing w:before="40" w:after="0"/>
+      <w:spacing w:before="40"/>
       <w:outlineLvl w:val="6"/>
     </w:pPr>
     <w:rPr>
@@ -793,7 +2785,6 @@
     <w:pPr>
       <w:keepNext/>
       <w:keepLines/>
-      <w:spacing w:after="0"/>
       <w:outlineLvl w:val="7"/>
     </w:pPr>
     <w:rPr>
@@ -816,7 +2807,6 @@
     <w:pPr>
       <w:keepNext/>
       <w:keepLines/>
-      <w:spacing w:after="0"/>
       <w:outlineLvl w:val="8"/>
     </w:pPr>
     <w:rPr>
@@ -921,9 +2911,7 @@
       <w:jc w:val="both"/>
     </w:pPr>
     <w:rPr>
-      <w:rFonts w:eastAsia="Calibri" w:cs="Times New Roman"/>
-      <w:kern w:val="0"/>
-      <w14:ligatures w14:val="none"/>
+      <w:rFonts w:eastAsia="Calibri"/>
     </w:rPr>
   </w:style>
   <w:style w:type="character" w:customStyle="1" w:styleId="APANormalCar">
@@ -1055,7 +3043,7 @@
     <w:qFormat/>
     <w:rsid w:val="00FB134C"/>
     <w:pPr>
-      <w:spacing w:after="80" w:line="240" w:lineRule="auto"/>
+      <w:spacing w:after="80"/>
       <w:contextualSpacing/>
     </w:pPr>
     <w:rPr>
@@ -1149,7 +3137,6 @@
   <w:style w:type="paragraph" w:styleId="Prrafodelista">
     <w:name w:val="List Paragraph"/>
     <w:basedOn w:val="Normal"/>
-    <w:uiPriority w:val="34"/>
     <w:qFormat/>
     <w:rsid w:val="00FB134C"/>
     <w:pPr>

</xml_diff>